<commit_message>
update ui and some functions
</commit_message>
<xml_diff>
--- a/OKAZAKI_Ryo_resume_en.docx
+++ b/OKAZAKI_Ryo_resume_en.docx
@@ -1334,6 +1334,26 @@
               </w:r>
             </w:hyperlink>
           </w:p>
+          <w:p>
+            <w:pPr>
+              <w:pStyle w:val="aa"/>
+              <w:numPr>
+                <w:ilvl w:val="0"/>
+                <w:numId w:val="32"/>
+              </w:numPr>
+              <w:ind w:leftChars="0"/>
+              <w:rPr>
+                <w:lang w:eastAsia="ja-JP"/>
+              </w:rPr>
+            </w:pPr>
+            <w:r>
+              <w:rPr>
+                <w:rFonts w:hint="eastAsia"/>
+                <w:lang w:eastAsia="ja-JP"/>
+              </w:rPr>
+              <w:t xml:space="preserve">ML : </w:t>
+            </w:r>
+          </w:p>
         </w:tc>
       </w:tr>
     </w:tbl>
@@ -2044,6 +2064,7 @@
               <w:rPr>
                 <w:lang w:eastAsia="ja-JP"/>
               </w:rPr>
+              <w:lastRenderedPageBreak/>
               <w:t xml:space="preserve">Translation of APA (Advanced Pricing Arrangement) decks for </w:t>
             </w:r>
             <w:r>
@@ -2113,7 +2134,6 @@
                 <w:rFonts w:hint="eastAsia"/>
                 <w:b/>
               </w:rPr>
-              <w:lastRenderedPageBreak/>
               <w:t>WORK EXPERIENCE</w:t>
             </w:r>
           </w:p>
@@ -2872,21 +2892,7 @@
               <w:rPr>
                 <w:lang w:eastAsia="ja-JP"/>
               </w:rPr>
-              <w:t xml:space="preserve">I enrolled in concurrent programs that </w:t>
-            </w:r>
-            <w:proofErr w:type="gramStart"/>
-            <w:r>
-              <w:rPr>
-                <w:lang w:eastAsia="ja-JP"/>
-              </w:rPr>
-              <w:t>is</w:t>
-            </w:r>
-            <w:proofErr w:type="gramEnd"/>
-            <w:r>
-              <w:rPr>
-                <w:lang w:eastAsia="ja-JP"/>
-              </w:rPr>
-              <w:t xml:space="preserve"> mixed of language and the course of game theory.</w:t>
+              <w:t>I enrolled in concurrent programs that is mixed of language and the course of game theory.</w:t>
             </w:r>
           </w:p>
         </w:tc>

</xml_diff>

<commit_message>
update the codes for the web
</commit_message>
<xml_diff>
--- a/OKAZAKI_Ryo_resume_en.docx
+++ b/OKAZAKI_Ryo_resume_en.docx
@@ -34,24 +34,7 @@
           <w:szCs w:val="32"/>
           <w:lang w:eastAsia="ja-JP"/>
         </w:rPr>
-        <w:t>Ok</w:t>
-      </w:r>
-      <w:r>
-        <w:rPr>
-          <w:rFonts w:hint="eastAsia"/>
-          <w:sz w:val="32"/>
-          <w:szCs w:val="32"/>
-          <w:lang w:eastAsia="ja-JP"/>
-        </w:rPr>
-        <w:t>s</w:t>
-      </w:r>
-      <w:r>
-        <w:rPr>
-          <w:sz w:val="32"/>
-          <w:szCs w:val="32"/>
-          <w:lang w:eastAsia="ja-JP"/>
-        </w:rPr>
-        <w:t>azaki</w:t>
+        <w:t>Okazaki</w:t>
       </w:r>
     </w:p>
     <w:p>
@@ -998,6 +981,7 @@
           <w:p>
             <w:pPr>
               <w:rPr>
+                <w:rFonts w:hint="eastAsia"/>
                 <w:b/>
                 <w:lang w:eastAsia="ja-JP"/>
               </w:rPr>
@@ -1015,7 +999,15 @@
                 <w:b/>
                 <w:lang w:eastAsia="ja-JP"/>
               </w:rPr>
-              <w:t>ional Project</w:t>
+              <w:t xml:space="preserve">ional </w:t>
+            </w:r>
+            <w:r>
+              <w:rPr>
+                <w:rFonts w:hint="eastAsia"/>
+                <w:b/>
+                <w:lang w:eastAsia="ja-JP"/>
+              </w:rPr>
+              <w:t>Development</w:t>
             </w:r>
           </w:p>
         </w:tc>
@@ -1178,7 +1170,28 @@
                 <w:rFonts w:hint="eastAsia"/>
                 <w:lang w:eastAsia="ja-JP"/>
               </w:rPr>
-              <w:t xml:space="preserve">DI and </w:t>
+              <w:t>DI</w:t>
+            </w:r>
+            <w:r>
+              <w:rPr>
+                <w:rFonts w:hint="eastAsia"/>
+                <w:lang w:eastAsia="ja-JP"/>
+              </w:rPr>
+              <w:t>, ML</w:t>
+            </w:r>
+            <w:r>
+              <w:rPr>
+                <w:rFonts w:hint="eastAsia"/>
+                <w:lang w:eastAsia="ja-JP"/>
+              </w:rPr>
+              <w:t xml:space="preserve"> analytics</w:t>
+            </w:r>
+            <w:r>
+              <w:rPr>
+                <w:rFonts w:hint="eastAsia"/>
+                <w:lang w:eastAsia="ja-JP"/>
+              </w:rPr>
+              <w:t xml:space="preserve"> and </w:t>
             </w:r>
             <w:r>
               <w:rPr>
@@ -1351,8 +1364,73 @@
                 <w:rFonts w:hint="eastAsia"/>
                 <w:lang w:eastAsia="ja-JP"/>
               </w:rPr>
-              <w:t xml:space="preserve">ML : </w:t>
-            </w:r>
+              <w:t>F</w:t>
+            </w:r>
+            <w:r>
+              <w:rPr>
+                <w:lang w:eastAsia="ja-JP"/>
+              </w:rPr>
+              <w:t>ull</w:t>
+            </w:r>
+            <w:r>
+              <w:rPr>
+                <w:lang w:eastAsia="ja-JP"/>
+              </w:rPr>
+              <w:noBreakHyphen/>
+              <w:t xml:space="preserve">stack ML </w:t>
+            </w:r>
+            <w:r>
+              <w:rPr>
+                <w:rFonts w:hint="eastAsia"/>
+                <w:lang w:eastAsia="ja-JP"/>
+              </w:rPr>
+              <w:t>A</w:t>
+            </w:r>
+            <w:r>
+              <w:rPr>
+                <w:lang w:eastAsia="ja-JP"/>
+              </w:rPr>
+              <w:t xml:space="preserve">nalytics </w:t>
+            </w:r>
+            <w:proofErr w:type="gramStart"/>
+            <w:r>
+              <w:rPr>
+                <w:rFonts w:hint="eastAsia"/>
+                <w:lang w:eastAsia="ja-JP"/>
+              </w:rPr>
+              <w:t>App</w:t>
+            </w:r>
+            <w:r>
+              <w:rPr>
+                <w:rFonts w:hint="eastAsia"/>
+                <w:lang w:eastAsia="ja-JP"/>
+              </w:rPr>
+              <w:t xml:space="preserve"> </w:t>
+            </w:r>
+            <w:r>
+              <w:rPr>
+                <w:rFonts w:hint="eastAsia"/>
+                <w:lang w:eastAsia="ja-JP"/>
+              </w:rPr>
+              <w:t>:</w:t>
+            </w:r>
+            <w:proofErr w:type="gramEnd"/>
+            <w:r>
+              <w:rPr>
+                <w:rFonts w:hint="eastAsia"/>
+                <w:lang w:eastAsia="ja-JP"/>
+              </w:rPr>
+              <w:t xml:space="preserve"> </w:t>
+            </w:r>
+            <w:hyperlink r:id="rId12" w:history="1">
+              <w:r>
+                <w:rPr>
+                  <w:rStyle w:val="a3"/>
+                  <w:lang w:eastAsia="ja-JP"/>
+                </w:rPr>
+                <w:t>https://github.com/leo-magma/machine-learning</w:t>
+              </w:r>
+            </w:hyperlink>
           </w:p>
         </w:tc>
       </w:tr>
@@ -2892,7 +2970,21 @@
               <w:rPr>
                 <w:lang w:eastAsia="ja-JP"/>
               </w:rPr>
-              <w:t>I enrolled in concurrent programs that is mixed of language and the course of game theory.</w:t>
+              <w:t xml:space="preserve">I enrolled in concurrent programs that </w:t>
+            </w:r>
+            <w:proofErr w:type="gramStart"/>
+            <w:r>
+              <w:rPr>
+                <w:lang w:eastAsia="ja-JP"/>
+              </w:rPr>
+              <w:t>is</w:t>
+            </w:r>
+            <w:proofErr w:type="gramEnd"/>
+            <w:r>
+              <w:rPr>
+                <w:lang w:eastAsia="ja-JP"/>
+              </w:rPr>
+              <w:t xml:space="preserve"> mixed of language and the course of game theory.</w:t>
             </w:r>
           </w:p>
         </w:tc>
@@ -8102,7 +8194,6 @@
   <w:style w:type="character" w:default="1" w:styleId="a0">
     <w:name w:val="Default Paragraph Font"/>
     <w:uiPriority w:val="1"/>
-    <w:semiHidden/>
     <w:unhideWhenUsed/>
   </w:style>
   <w:style w:type="table" w:default="1" w:styleId="a1">

</xml_diff>